<commit_message>
Say where one booking replica beats several: at 3 and 4 vCPU, not at 2
</commit_message>
<xml_diff>
--- a/docs/reports/booking-configuration-study-2026-10-19.docx
+++ b/docs/reports/booking-configuration-study-2026-10-19.docx
@@ -73,7 +73,7 @@
         <w:pStyle w:val="ListBullet"/>
       </w:pPr>
       <w:r>
-        <w:t>For the booking pool on the 8 vCPU VM, one replica with more slots (1x3, 1x4) gives the highest throughput and the lowest p95 at 10 clients; more replicas shed fewer refinements but queue blindly behind the proxy and are slower.</w:t>
+        <w:t>For the booking pool at 3 and 4 vCPU, one replica with more slots wins: 1x4 gives the highest throughput and the lowest p95 at 10 clients and 1x3 beats 3x1. At 2 vCPU two single-slot replicas beat 1x2.</w:t>
       </w:r>
     </w:p>
     <w:p>
@@ -10845,7 +10845,7 @@
         <w:pStyle w:val="ListBullet"/>
       </w:pPr>
       <w:r>
-        <w:t>1x3 and 1x4 give the best throughput and p95 at 10 clients. One admission queue sees all its slots; several replicas behind round-robin DNS let a call wait at a busy replica while another is idle, and their per-replica road and identity caches are colder.</w:t>
+        <w:t>At 3 and 4 vCPU one replica wins: 1x4 gives the best throughput and p95 at 10 clients and 1x3 beats 3x1; at 2 vCPU 2x1 beats 1x2. One admission queue sees all its slots; several replicas behind round-robin DNS let a call wait at a busy replica while another is idle, and their per-replica road and identity caches are colder.</w:t>
       </w:r>
     </w:p>
     <w:p>
@@ -12639,7 +12639,7 @@
               <w:rPr>
                 <w:sz w:val="18"/>
               </w:rPr>
-              <w:t>Supported in direction, larger than predicted, and confounded: 1x3 against 3x1 at 5 clients is 348 against 1205 ms p50 with twice the throughput, but the multi-replica layouts also refine more (they shed less).</w:t>
+              <w:t>Partly supported. At 3 and 4 vCPU, larger than predicted: 1x3 against 3x1 at 5 clients is 348 against 1205 ms p50 with twice the throughput. Reversed at 2 vCPU (2x1 beat 1x2). Confounded: the multi-replica layouts also refine more (they shed less).</w:t>
             </w:r>
           </w:p>
         </w:tc>

</xml_diff>